<commit_message>
Complite lab PT 03
</commit_message>
<xml_diff>
--- a/PT(Programming technologies)/Lab PT 02&03-38 KD/Lab PT 03-38-report KD.docx
+++ b/PT(Programming technologies)/Lab PT 02&03-38 KD/Lab PT 03-38-report KD.docx
@@ -1984,7 +1984,7 @@
       </w:pPr>
       <w:r>
         <w:lastRenderedPageBreak/>
-        <w:t>Диаграмма отражает процесс оформления заказа клиентом. Основной поток включает: проверку отсутствия активных поездок, установление связи с модулем геолокации, запрос параметров поездки, выполнение подчинённых потоков (8А — указание адреса, 8Б — выбор типа услуги, 8В — выбор доп. опций, 8Г — выбор VIP-опций), проверку корректности данных и присвоение заказу уникального номера.</w:t>
+        <w:t>Диаграмма отражает процесс оформления заказа клиентом. Основной поток включает: проверку отсутствия активных поездок, запрос параметров поездки, выполнение подчинённых потоков (8А — указание адреса, 8Б — выбор типа услуги, 8В — выбор доп. опций, 8Г — выбор VIP-опций), проверку корректности данных и присвоение заказу уникального номера.</w:t>
       </w:r>
     </w:p>
     <w:p>
@@ -2007,26 +2007,6 @@
       </w:pPr>
       <w:r>
         <w:t xml:space="preserve">2А — обнаружен активный заказ </w:t>
-      </w:r>
-      <w:r>
-        <w:t>--&gt;</w:t>
-      </w:r>
-      <w:r>
-        <w:t xml:space="preserve"> ошибка </w:t>
-      </w:r>
-      <w:r>
-        <w:t>--&gt;</w:t>
-      </w:r>
-      <w:r>
-        <w:t xml:space="preserve"> завершение;</w:t>
-      </w:r>
-    </w:p>
-    <w:p>
-      <w:pPr>
-        <w:ind w:left="709" w:firstLine="0"/>
-      </w:pPr>
-      <w:r>
-        <w:t xml:space="preserve">4А — модуль геолокации недоступен </w:t>
       </w:r>
       <w:r>
         <w:t>--&gt;</w:t>
@@ -2117,10 +2097,10 @@
         </w:rPr>
         <w:lastRenderedPageBreak/>
         <w:drawing>
-          <wp:inline distT="0" distB="0" distL="0" distR="0" wp14:anchorId="1281594B" wp14:editId="074B41E7">
-            <wp:extent cx="5140325" cy="9251950"/>
-            <wp:effectExtent l="0" t="0" r="3175" b="6350"/>
-            <wp:docPr id="2" name="Рисунок 2"/>
+          <wp:inline distT="0" distB="0" distL="0" distR="0" wp14:anchorId="6F688408" wp14:editId="179E0BB0">
+            <wp:extent cx="5465445" cy="9251950"/>
+            <wp:effectExtent l="0" t="0" r="1905" b="6350"/>
+            <wp:docPr id="6" name="Рисунок 6"/>
             <wp:cNvGraphicFramePr>
               <a:graphicFrameLocks xmlns:a="http://schemas.openxmlformats.org/drawingml/2006/main" noChangeAspect="1"/>
             </wp:cNvGraphicFramePr>
@@ -2140,7 +2120,7 @@
                   <pic:spPr>
                     <a:xfrm>
                       <a:off x="0" y="0"/>
-                      <a:ext cx="5140325" cy="9251950"/>
+                      <a:ext cx="5465445" cy="9251950"/>
                     </a:xfrm>
                     <a:prstGeom prst="rect">
                       <a:avLst/>
@@ -2160,10 +2140,10 @@
       <w:r>
         <w:lastRenderedPageBreak/>
         <w:drawing>
-          <wp:inline distT="0" distB="0" distL="0" distR="0" wp14:anchorId="2009BD05" wp14:editId="14E28F07">
-            <wp:extent cx="2162175" cy="3240987"/>
-            <wp:effectExtent l="0" t="0" r="0" b="0"/>
-            <wp:docPr id="3" name="Рисунок 3"/>
+          <wp:inline distT="0" distB="0" distL="0" distR="0" wp14:anchorId="4F35D740" wp14:editId="412FB4F9">
+            <wp:extent cx="5940425" cy="4114165"/>
+            <wp:effectExtent l="0" t="0" r="3175" b="635"/>
+            <wp:docPr id="5" name="Рисунок 5"/>
             <wp:cNvGraphicFramePr>
               <a:graphicFrameLocks xmlns:a="http://schemas.openxmlformats.org/drawingml/2006/main" noChangeAspect="1"/>
             </wp:cNvGraphicFramePr>
@@ -2183,7 +2163,7 @@
                   <pic:spPr>
                     <a:xfrm>
                       <a:off x="0" y="0"/>
-                      <a:ext cx="2180605" cy="3268613"/>
+                      <a:ext cx="5940425" cy="4114165"/>
                     </a:xfrm>
                     <a:prstGeom prst="rect">
                       <a:avLst/>
@@ -2195,15 +2175,20 @@
           </wp:inline>
         </w:drawing>
       </w:r>
+    </w:p>
+    <w:p>
+      <w:pPr>
+        <w:ind w:left="709" w:firstLine="0"/>
+      </w:pPr>
       <w:r>
         <w:rPr>
           <w:noProof/>
         </w:rPr>
         <w:drawing>
-          <wp:inline distT="0" distB="0" distL="0" distR="0" wp14:anchorId="68776912" wp14:editId="49A39229">
-            <wp:extent cx="2176462" cy="3229741"/>
-            <wp:effectExtent l="0" t="0" r="0" b="8890"/>
-            <wp:docPr id="4" name="Рисунок 4"/>
+          <wp:inline distT="0" distB="0" distL="0" distR="0" wp14:anchorId="2009BD05" wp14:editId="14E28F07">
+            <wp:extent cx="2162175" cy="3240987"/>
+            <wp:effectExtent l="0" t="0" r="0" b="0"/>
+            <wp:docPr id="3" name="Рисунок 3"/>
             <wp:cNvGraphicFramePr>
               <a:graphicFrameLocks xmlns:a="http://schemas.openxmlformats.org/drawingml/2006/main" noChangeAspect="1"/>
             </wp:cNvGraphicFramePr>
@@ -2223,7 +2208,7 @@
                   <pic:spPr>
                     <a:xfrm>
                       <a:off x="0" y="0"/>
-                      <a:ext cx="2187893" cy="3246703"/>
+                      <a:ext cx="2180605" cy="3268613"/>
                     </a:xfrm>
                     <a:prstGeom prst="rect">
                       <a:avLst/>
@@ -2235,193 +2220,15 @@
           </wp:inline>
         </w:drawing>
       </w:r>
-    </w:p>
-    <w:p>
-      <w:pPr>
-        <w:ind w:left="709" w:firstLine="0"/>
-      </w:pPr>
-    </w:p>
-    <w:p>
-      <w:pPr>
-        <w:ind w:left="709" w:firstLine="0"/>
-        <w:rPr>
-          <w:u w:val="single"/>
-          <w:lang w:val="ru-BY"/>
-        </w:rPr>
-      </w:pPr>
-      <w:r>
-        <w:rPr>
-          <w:u w:val="single"/>
-          <w:lang w:val="ru-BY"/>
-        </w:rPr>
-        <w:t>Диаграмма деятельности для прецедента «Запросить рейтинг водителей по баллам»</w:t>
-      </w:r>
-    </w:p>
-    <w:p>
-      <w:pPr>
-        <w:ind w:left="709" w:firstLine="0"/>
-        <w:rPr>
-          <w:u w:val="single"/>
-          <w:lang w:val="ru-BY"/>
-        </w:rPr>
-      </w:pPr>
-    </w:p>
-    <w:p>
-      <w:pPr>
-        <w:ind w:left="709" w:firstLine="0"/>
-      </w:pPr>
-      <w:r>
-        <w:t>Автор: Король Д. Е.</w:t>
-      </w:r>
-    </w:p>
-    <w:p>
-      <w:pPr>
-        <w:ind w:left="709" w:firstLine="0"/>
-      </w:pPr>
-      <w:r>
-        <w:t>Дорожки (Swimlanes): Администратор | Система | Аналитический модуль.</w:t>
-      </w:r>
-    </w:p>
-    <w:p>
-      <w:pPr>
-        <w:ind w:left="709" w:firstLine="0"/>
-      </w:pPr>
-      <w:r>
-        <w:t>Краткое описание диаграммы:</w:t>
-      </w:r>
-    </w:p>
-    <w:p>
-      <w:pPr>
-        <w:ind w:left="709" w:firstLine="0"/>
-      </w:pPr>
-      <w:r>
-        <w:t>Диаграмма отражает процесс формирования аналитического отчёта администратором. Основной поток включает: проверку прав доступа, установление связи с аналитическим модулем, запрос действия (топ лучших / топ худших), указание периода, проверку наличия данных и выполнение одного из подчинённых потоков (8А — расчёт максимальных баллов, 8Б — расчёт минимальных баллов), завершение сеанса связи и вывод итоговой таблицы.</w:t>
-      </w:r>
-    </w:p>
-    <w:p>
-      <w:pPr>
-        <w:ind w:left="709" w:firstLine="0"/>
-      </w:pPr>
-      <w:r>
-        <w:t>Альтернативные потоки:</w:t>
-      </w:r>
-    </w:p>
-    <w:p>
-      <w:pPr>
-        <w:ind w:left="709" w:firstLine="0"/>
-      </w:pPr>
-      <w:r>
-        <w:t xml:space="preserve">2А — недостаточно прав </w:t>
-      </w:r>
-      <w:r>
-        <w:t>--&gt;</w:t>
-      </w:r>
-      <w:r>
-        <w:t xml:space="preserve"> ошибка </w:t>
-      </w:r>
-      <w:r>
-        <w:t>--&gt;</w:t>
-      </w:r>
-      <w:r>
-        <w:t xml:space="preserve"> завершение;</w:t>
-      </w:r>
-    </w:p>
-    <w:p>
-      <w:pPr>
-        <w:ind w:left="709" w:firstLine="0"/>
-      </w:pPr>
-      <w:r>
-        <w:t xml:space="preserve">4А — аналитический модуль не отвечает </w:t>
-      </w:r>
-      <w:r>
-        <w:t>--&gt;</w:t>
-      </w:r>
-      <w:r>
-        <w:t xml:space="preserve"> ошибка </w:t>
-      </w:r>
-      <w:r>
-        <w:t>--&gt;</w:t>
-      </w:r>
-      <w:r>
-        <w:t xml:space="preserve"> завершение;</w:t>
-      </w:r>
-    </w:p>
-    <w:p>
-      <w:pPr>
-        <w:ind w:left="709" w:firstLine="0"/>
-      </w:pPr>
-      <w:r>
-        <w:t xml:space="preserve">7А — данные за период отсутствуют </w:t>
-      </w:r>
-      <w:r>
-        <w:t>--&gt;</w:t>
-      </w:r>
-      <w:r>
-        <w:t xml:space="preserve"> возврат к шагу 5.</w:t>
-      </w:r>
-    </w:p>
-    <w:p>
-      <w:pPr>
-        <w:ind w:left="709" w:firstLine="0"/>
-      </w:pPr>
-      <w:r>
-        <w:t xml:space="preserve">Траектория объекта: запрос администратора </w:t>
-      </w:r>
-      <w:r>
-        <w:t>--&gt;</w:t>
-      </w:r>
-      <w:r>
-        <w:t xml:space="preserve"> проверка прав </w:t>
-      </w:r>
-      <w:r>
-        <w:t>--&gt;</w:t>
-      </w:r>
-      <w:r>
-        <w:t xml:space="preserve"> соединение с модулем </w:t>
-      </w:r>
-      <w:r>
-        <w:t>--&gt;</w:t>
-      </w:r>
-      <w:r>
-        <w:t xml:space="preserve"> выбор действия и периода </w:t>
-      </w:r>
-      <w:r>
-        <w:t>--&gt;</w:t>
-      </w:r>
-      <w:r>
-        <w:t xml:space="preserve"> выборка из БД </w:t>
-      </w:r>
-      <w:r>
-        <w:t>--&gt;</w:t>
-      </w:r>
-      <w:r>
-        <w:t xml:space="preserve"> агрегация и сортировка </w:t>
-      </w:r>
-      <w:r>
-        <w:t>--&gt;</w:t>
-      </w:r>
-      <w:r>
-        <w:t xml:space="preserve"> формирование списка (код, ФИО, балл) </w:t>
-      </w:r>
-      <w:r>
-        <w:t>--&gt;</w:t>
-      </w:r>
-      <w:r>
-        <w:t xml:space="preserve"> вывод таблицы.</w:t>
-      </w:r>
-    </w:p>
-    <w:p/>
-    <w:p>
       <w:r>
         <w:rPr>
           <w:noProof/>
         </w:rPr>
-        <w:lastRenderedPageBreak/>
         <w:drawing>
-          <wp:inline distT="0" distB="0" distL="0" distR="0" wp14:anchorId="36D7BB5E" wp14:editId="0D3BE56F">
-            <wp:extent cx="5003165" cy="9251950"/>
-            <wp:effectExtent l="0" t="0" r="6985" b="6350"/>
-            <wp:docPr id="1" name="Рисунок 1"/>
+          <wp:inline distT="0" distB="0" distL="0" distR="0" wp14:anchorId="68776912" wp14:editId="49A39229">
+            <wp:extent cx="2176462" cy="3229741"/>
+            <wp:effectExtent l="0" t="0" r="0" b="8890"/>
+            <wp:docPr id="4" name="Рисунок 4"/>
             <wp:cNvGraphicFramePr>
               <a:graphicFrameLocks xmlns:a="http://schemas.openxmlformats.org/drawingml/2006/main" noChangeAspect="1"/>
             </wp:cNvGraphicFramePr>
@@ -2441,7 +2248,206 @@
                   <pic:spPr>
                     <a:xfrm>
                       <a:off x="0" y="0"/>
-                      <a:ext cx="5003165" cy="9251950"/>
+                      <a:ext cx="2187893" cy="3246703"/>
+                    </a:xfrm>
+                    <a:prstGeom prst="rect">
+                      <a:avLst/>
+                    </a:prstGeom>
+                  </pic:spPr>
+                </pic:pic>
+              </a:graphicData>
+            </a:graphic>
+          </wp:inline>
+        </w:drawing>
+      </w:r>
+    </w:p>
+    <w:p>
+      <w:pPr>
+        <w:ind w:left="709" w:firstLine="0"/>
+      </w:pPr>
+    </w:p>
+    <w:p>
+      <w:pPr>
+        <w:ind w:left="709" w:firstLine="0"/>
+        <w:rPr>
+          <w:u w:val="single"/>
+          <w:lang w:val="ru-BY"/>
+        </w:rPr>
+      </w:pPr>
+      <w:r>
+        <w:rPr>
+          <w:u w:val="single"/>
+          <w:lang w:val="ru-BY"/>
+        </w:rPr>
+        <w:t>Диаграмма деятельности для прецедента «Запросить рейтинг водителей по баллам»</w:t>
+      </w:r>
+    </w:p>
+    <w:p>
+      <w:pPr>
+        <w:ind w:left="709" w:firstLine="0"/>
+        <w:rPr>
+          <w:u w:val="single"/>
+          <w:lang w:val="ru-BY"/>
+        </w:rPr>
+      </w:pPr>
+    </w:p>
+    <w:p>
+      <w:pPr>
+        <w:ind w:left="709" w:firstLine="0"/>
+      </w:pPr>
+      <w:r>
+        <w:t>Автор: Король Д. Е.</w:t>
+      </w:r>
+    </w:p>
+    <w:p>
+      <w:pPr>
+        <w:ind w:left="709" w:firstLine="0"/>
+      </w:pPr>
+      <w:r>
+        <w:t>Дорожки (Swimlanes): Администратор | Система | Аналитический модуль.</w:t>
+      </w:r>
+    </w:p>
+    <w:p>
+      <w:pPr>
+        <w:ind w:left="709" w:firstLine="0"/>
+      </w:pPr>
+      <w:r>
+        <w:t>Краткое описание диаграммы:</w:t>
+      </w:r>
+    </w:p>
+    <w:p>
+      <w:pPr>
+        <w:ind w:left="709" w:firstLine="0"/>
+      </w:pPr>
+      <w:r>
+        <w:lastRenderedPageBreak/>
+        <w:t>Диаграмма отражает процесс формирования аналитического отчёта администратором. Основной поток включает: проверку прав доступа, запрос действия (топ лучших / топ худших), указание периода, проверку наличия данных и выполнение одного из подчинённых потоков (8А — расчёт максимальных баллов, 8Б — расчёт минимальных баллов)</w:t>
+      </w:r>
+      <w:r>
+        <w:t xml:space="preserve"> </w:t>
+      </w:r>
+      <w:r>
+        <w:t>и вывод итоговой таблицы.</w:t>
+      </w:r>
+    </w:p>
+    <w:p>
+      <w:pPr>
+        <w:ind w:left="709" w:firstLine="0"/>
+      </w:pPr>
+      <w:r>
+        <w:t>Альтернативные потоки:</w:t>
+      </w:r>
+    </w:p>
+    <w:p>
+      <w:pPr>
+        <w:ind w:left="709" w:firstLine="0"/>
+      </w:pPr>
+      <w:r>
+        <w:t xml:space="preserve">2А — недостаточно прав </w:t>
+      </w:r>
+      <w:r>
+        <w:t>--&gt;</w:t>
+      </w:r>
+      <w:r>
+        <w:t xml:space="preserve"> ошибка </w:t>
+      </w:r>
+      <w:r>
+        <w:t>--&gt;</w:t>
+      </w:r>
+      <w:r>
+        <w:t xml:space="preserve"> завершение;</w:t>
+      </w:r>
+    </w:p>
+    <w:p>
+      <w:pPr>
+        <w:ind w:left="709" w:firstLine="0"/>
+      </w:pPr>
+      <w:r>
+        <w:t xml:space="preserve">7А — данные за период отсутствуют </w:t>
+      </w:r>
+      <w:r>
+        <w:t>--&gt;</w:t>
+      </w:r>
+      <w:r>
+        <w:t xml:space="preserve"> возврат к шагу 5.</w:t>
+      </w:r>
+    </w:p>
+    <w:p>
+      <w:pPr>
+        <w:ind w:left="709" w:firstLine="0"/>
+      </w:pPr>
+      <w:r>
+        <w:t xml:space="preserve">Траектория объекта: запрос администратора </w:t>
+      </w:r>
+      <w:r>
+        <w:t>--&gt;</w:t>
+      </w:r>
+      <w:r>
+        <w:t xml:space="preserve"> проверка прав </w:t>
+      </w:r>
+      <w:r>
+        <w:t>--&gt;</w:t>
+      </w:r>
+      <w:r>
+        <w:t xml:space="preserve"> выбор действия и периода </w:t>
+      </w:r>
+      <w:r>
+        <w:t>--&gt;</w:t>
+      </w:r>
+      <w:r>
+        <w:t xml:space="preserve"> выборка из БД </w:t>
+      </w:r>
+      <w:r>
+        <w:t>--&gt;</w:t>
+      </w:r>
+      <w:r>
+        <w:t xml:space="preserve"> агрегация и сортировка </w:t>
+      </w:r>
+      <w:r>
+        <w:t>--&gt;</w:t>
+      </w:r>
+      <w:r>
+        <w:t xml:space="preserve"> формирование списка (код, ФИО, балл) </w:t>
+      </w:r>
+      <w:r>
+        <w:t>--&gt;</w:t>
+      </w:r>
+      <w:r>
+        <w:t xml:space="preserve"> вывод таблицы.</w:t>
+      </w:r>
+    </w:p>
+    <w:p/>
+    <w:p>
+      <w:r>
+        <w:rPr>
+          <w:noProof/>
+        </w:rPr>
+        <w:lastRenderedPageBreak/>
+        <w:drawing>
+          <wp:inline distT="0" distB="0" distL="0" distR="0" wp14:anchorId="557F4995" wp14:editId="0F36C16F">
+            <wp:extent cx="3801110" cy="9251950"/>
+            <wp:effectExtent l="0" t="0" r="8890" b="6350"/>
+            <wp:docPr id="1" name="Рисунок 1"/>
+            <wp:cNvGraphicFramePr>
+              <a:graphicFrameLocks xmlns:a="http://schemas.openxmlformats.org/drawingml/2006/main" noChangeAspect="1"/>
+            </wp:cNvGraphicFramePr>
+            <a:graphic xmlns:a="http://schemas.openxmlformats.org/drawingml/2006/main">
+              <a:graphicData uri="http://schemas.openxmlformats.org/drawingml/2006/picture">
+                <pic:pic xmlns:pic="http://schemas.openxmlformats.org/drawingml/2006/picture">
+                  <pic:nvPicPr>
+                    <pic:cNvPr id="1" name=""/>
+                    <pic:cNvPicPr/>
+                  </pic:nvPicPr>
+                  <pic:blipFill>
+                    <a:blip r:embed="rId9"/>
+                    <a:stretch>
+                      <a:fillRect/>
+                    </a:stretch>
+                  </pic:blipFill>
+                  <pic:spPr>
+                    <a:xfrm>
+                      <a:off x="0" y="0"/>
+                      <a:ext cx="3801110" cy="9251950"/>
                     </a:xfrm>
                     <a:prstGeom prst="rect">
                       <a:avLst/>

</xml_diff>

<commit_message>
Correct report for PT lab 3
</commit_message>
<xml_diff>
--- a/PT(Programming technologies)/Lab PT 02&03-38 KD/Lab PT 03-38-report KD.docx
+++ b/PT(Programming technologies)/Lab PT 02&03-38 KD/Lab PT 03-38-report KD.docx
@@ -2138,6 +2138,9 @@
         <w:ind w:left="709" w:firstLine="0"/>
       </w:pPr>
       <w:r>
+        <w:rPr>
+          <w:noProof/>
+        </w:rPr>
         <w:lastRenderedPageBreak/>
         <w:drawing>
           <wp:inline distT="0" distB="0" distL="0" distR="0" wp14:anchorId="4F35D740" wp14:editId="412FB4F9">
@@ -2304,7 +2307,10 @@
         <w:ind w:left="709" w:firstLine="0"/>
       </w:pPr>
       <w:r>
-        <w:t>Дорожки (Swimlanes): Администратор | Система | Аналитический модуль.</w:t>
+        <w:t>Дорожки (Swimlanes): Администратор | Система</w:t>
+      </w:r>
+      <w:r>
+        <w:t>.</w:t>
       </w:r>
     </w:p>
     <w:p>
@@ -2320,8 +2326,11 @@
         <w:ind w:left="709" w:firstLine="0"/>
       </w:pPr>
       <w:r>
+        <w:t xml:space="preserve">Диаграмма отражает процесс формирования аналитического отчёта администратором. Основной поток включает: проверку прав доступа, </w:t>
+      </w:r>
+      <w:r>
         <w:lastRenderedPageBreak/>
-        <w:t>Диаграмма отражает процесс формирования аналитического отчёта администратором. Основной поток включает: проверку прав доступа, запрос действия (топ лучших / топ худших), указание периода, проверку наличия данных и выполнение одного из подчинённых потоков (8А — расчёт максимальных баллов, 8Б — расчёт минимальных баллов)</w:t>
+        <w:t>запрос действия (топ лучших / топ худших), указание периода, проверку наличия данных и выполнение одного из подчинённых потоков (8А — расчёт максимальных баллов, 8Б — расчёт минимальных баллов)</w:t>
       </w:r>
       <w:r>
         <w:t xml:space="preserve"> </w:t>
@@ -4229,6 +4238,78 @@
       <w:rFonts w:cs="Calibri"/>
     </w:rPr>
   </w:style>
+  <w:style w:type="character" w:styleId="a6">
+    <w:name w:val="annotation reference"/>
+    <w:basedOn w:val="a0"/>
+    <w:uiPriority w:val="99"/>
+    <w:semiHidden/>
+    <w:unhideWhenUsed/>
+    <w:rsid w:val="008B364E"/>
+    <w:rPr>
+      <w:sz w:val="16"/>
+      <w:szCs w:val="16"/>
+    </w:rPr>
+  </w:style>
+  <w:style w:type="paragraph" w:styleId="a7">
+    <w:name w:val="annotation text"/>
+    <w:basedOn w:val="a"/>
+    <w:link w:val="a8"/>
+    <w:uiPriority w:val="99"/>
+    <w:semiHidden/>
+    <w:unhideWhenUsed/>
+    <w:rsid w:val="008B364E"/>
+    <w:pPr>
+      <w:spacing w:line="240" w:lineRule="auto"/>
+    </w:pPr>
+    <w:rPr>
+      <w:sz w:val="20"/>
+      <w:szCs w:val="20"/>
+    </w:rPr>
+  </w:style>
+  <w:style w:type="character" w:customStyle="1" w:styleId="a8">
+    <w:name w:val="Текст примечания Знак"/>
+    <w:basedOn w:val="a0"/>
+    <w:link w:val="a7"/>
+    <w:uiPriority w:val="99"/>
+    <w:semiHidden/>
+    <w:rsid w:val="008B364E"/>
+    <w:rPr>
+      <w:rFonts w:ascii="Times New Roman" w:eastAsia="Calibri" w:hAnsi="Times New Roman" w:cs="Times New Roman"/>
+      <w:sz w:val="20"/>
+      <w:szCs w:val="20"/>
+      <w:lang w:val="ru-RU"/>
+    </w:rPr>
+  </w:style>
+  <w:style w:type="paragraph" w:styleId="a9">
+    <w:name w:val="annotation subject"/>
+    <w:basedOn w:val="a7"/>
+    <w:next w:val="a7"/>
+    <w:link w:val="aa"/>
+    <w:uiPriority w:val="99"/>
+    <w:semiHidden/>
+    <w:unhideWhenUsed/>
+    <w:rsid w:val="008B364E"/>
+    <w:rPr>
+      <w:b/>
+      <w:bCs/>
+    </w:rPr>
+  </w:style>
+  <w:style w:type="character" w:customStyle="1" w:styleId="aa">
+    <w:name w:val="Тема примечания Знак"/>
+    <w:basedOn w:val="a8"/>
+    <w:link w:val="a9"/>
+    <w:uiPriority w:val="99"/>
+    <w:semiHidden/>
+    <w:rsid w:val="008B364E"/>
+    <w:rPr>
+      <w:rFonts w:ascii="Times New Roman" w:eastAsia="Calibri" w:hAnsi="Times New Roman" w:cs="Times New Roman"/>
+      <w:b/>
+      <w:bCs/>
+      <w:sz w:val="20"/>
+      <w:szCs w:val="20"/>
+      <w:lang w:val="ru-RU"/>
+    </w:rPr>
+  </w:style>
 </w:styles>
 </file>
 

</xml_diff>